<commit_message>
fix: hardcode jabatan in signature block exactly as requested, restore [.....3] to Nama Pejabat Pengirim Surat
</commit_message>
<xml_diff>
--- a/storage/template/peneltian/Format_Surat_Izin_peneltian.docx
+++ b/storage/template/peneltian/Format_Surat_Izin_peneltian.docx
@@ -232,7 +232,13 @@
         <w:rPr>
           <w:color w:val="000000"/>
         </w:rPr>
-        <w:t>Di [......5]</w:t>
+        <w:t>d</w:t>
+      </w:r>
+      <w:r>
+        <w:rPr>
+          <w:color w:val="000000"/>
+        </w:rPr>
+        <w:t>i [......5]</w:t>
       </w:r>
     </w:p>
     <w:p>
@@ -342,15 +348,13 @@
         <w:jc w:val="both"/>
       </w:pPr>
       <w:r>
-        <w:t xml:space="preserve">Proposal penelitian dan teknis pelaksanaan kegiatan dapat disampaikan dan dikoordinasikan dengan pegawai kami Bapak Haris </w:t>
-      </w:r>
-      <w:proofErr w:type="spellStart"/>
-      <w:r>
-        <w:t>Nasiroedin</w:t>
-      </w:r>
-      <w:proofErr w:type="spellEnd"/>
-      <w:r>
-        <w:t xml:space="preserve"> (+62 812-1161-5505).</w:t>
+        <w:t xml:space="preserve">Proposal penelitian dan teknis pelaksanaan kegiatan dapat disampaikan dan dikoordinasikan dengan pegawai kami </w:t>
+      </w:r>
+      <w:r>
+        <w:t>[PJ_penelitan_input_manual]</w:t>
+      </w:r>
+      <w:r>
+        <w:t>.</w:t>
       </w:r>
     </w:p>
     <w:p>
@@ -833,23 +837,7 @@
         <w:sz w:val="20"/>
         <w:szCs w:val="20"/>
       </w:rPr>
-      <w:t xml:space="preserve">Jalan </w:t>
-    </w:r>
-    <w:proofErr w:type="spellStart"/>
-    <w:r>
-      <w:rPr>
-        <w:sz w:val="20"/>
-        <w:szCs w:val="20"/>
-      </w:rPr>
-      <w:t>Kayoon</w:t>
-    </w:r>
-    <w:proofErr w:type="spellEnd"/>
-    <w:r>
-      <w:rPr>
-        <w:sz w:val="20"/>
-        <w:szCs w:val="20"/>
-      </w:rPr>
-      <w:t xml:space="preserve"> No. 50-52, Genteng, Surabaya, Jawa Timur 60271 </w:t>
+      <w:t xml:space="preserve">Jalan Kayoon No. 50-52, Genteng, Surabaya, Jawa Timur 60271 </w:t>
     </w:r>
   </w:p>
   <w:p>
@@ -929,23 +917,7 @@
         <w:sz w:val="20"/>
         <w:szCs w:val="20"/>
       </w:rPr>
-      <w:t>Pos-</w:t>
-    </w:r>
-    <w:proofErr w:type="spellStart"/>
-    <w:r>
-      <w:rPr>
-        <w:sz w:val="20"/>
-        <w:szCs w:val="20"/>
-      </w:rPr>
-      <w:t>el</w:t>
-    </w:r>
-    <w:proofErr w:type="spellEnd"/>
-    <w:r>
-      <w:rPr>
-        <w:sz w:val="20"/>
-        <w:szCs w:val="20"/>
-      </w:rPr>
-      <w:t xml:space="preserve">: </w:t>
+      <w:t xml:space="preserve">Pos-el: </w:t>
     </w:r>
     <w:hyperlink r:id="rId3">
       <w:r>

</xml_diff>